<commit_message>
Acts 2nd in-depth re-review (Sep 25): 2 EN restorations (both KO-asymmetric) — ch12 'and the Jews' (MSG 'Fed up with Judea and Jews'), ch23 'mules'->'horses' revert; GDocs 28/28 export-back verified
</commit_message>
<xml_diff>
--- a/gdocs_build/Acts.docx
+++ b/gdocs_build/Acts.docx
@@ -13869,7 +13869,7 @@
               <w:rPr>
                 <w:sz w:val="18"/>
               </w:rPr>
-              <w:t>At daybreak the prison was in chaos. "Where's Peter? What happened to Peter?" When Herod ordered Peter brought out and the guards couldn't produce him or explain what happened, Herod had them executed: "Off with their heads!" Fed up with Judea, he left for Caesarea to cool off.</w:t>
+              <w:t>At daybreak the prison was in chaos. "Where's Peter? What happened to Peter?" When Herod ordered Peter brought out and the guards couldn't produce him or explain what happened, Herod had them executed: "Off with their heads!" Fed up with Judea and the Jews, he left for Caesarea to cool off.</w:t>
             </w:r>
           </w:p>
         </w:tc>
@@ -28111,7 +28111,7 @@
               <w:rPr>
                 <w:sz w:val="18"/>
               </w:rPr>
-              <w:t>The commander called two centurions. "Get two hundred soldiers ready to leave for Caesarea immediately. Add seventy horsemen and two hundred spearmen. I want them ready to march by nine o'clock tonight. And get a couple of horses for Paul and his gear. We're delivering this man safe and sound to Governor Felix."</w:t>
+              <w:t>The commander called two centurions. "Get two hundred soldiers ready to leave for Caesarea immediately. Add seventy horsemen and two hundred spearmen. I want them ready to march by nine o'clock tonight. And get a couple of mules for Paul and his gear. We're delivering this man safe and sound to Governor Felix."</w:t>
             </w:r>
           </w:p>
         </w:tc>

</xml_diff>

<commit_message>
Acts 3rd-pass: 4 fixes (accuracy/reverse-check/consistency)
- ch2 P11 EN/KO: 'sick and twisted generation' -> 'sick and twisted culture'
  (MSG: 'sick and stupid culture'; 'twisted' is acceptable softening,
  but 'generation' != 'culture')
- ch27 P3 EN: 'Egyptian grain ship' -> 'Egyptian ship'
  (remove 'grain' addition not in MSG — reverse-check)
- ch28 P4 KO: '쌍둥이자리' -> '카스토르와 폴룩스'
  (match EN 'Castor and Pollux'; KO had old 'Gemini' rendering)

Verified already correct (no action):
- ch23 P15 'mules'/'노새' matches MSG (2nd-pass 'horses' was reverted)
- ch12 P9 'Judea and the Jews' present
- ch15 'Jewish believers', ch17 'chatterbox', ch18 'made your choice',
  ch27 EN 'grain ship' (reverted), ch28 EN 'Castor and Pollux' maintained

validate_translation.py PASS (28 ch), build_gdocs VERIFY_DROPPED=0,
teen_without_msg=0, msg_orphans=0. Doc 11z558cFT0xrKqs-pbcZBLbu2DhyFDB6E6DWHxBchyrM
updated, API 28/28, export-back verified.
</commit_message>
<xml_diff>
--- a/gdocs_build/Acts.docx
+++ b/gdocs_build/Acts.docx
@@ -1940,7 +1940,7 @@
               <w:rPr>
                 <w:sz w:val="18"/>
               </w:rPr>
-              <w:t>He kept going like this for a long time, urging them again and again: "Get out while you can — get out of this sick and twisted generation!"</w:t>
+              <w:t>He kept going like this for a long time, urging them again and again: "Get out while you can — get out of this sick and twisted culture!"</w:t>
             </w:r>
           </w:p>
         </w:tc>
@@ -1963,7 +1963,7 @@
               <w:rPr>
                 <w:sz w:val="18"/>
               </w:rPr>
-              <w:t>베드로는 한참 동안 이렇게 계속 말하며 거듭 간곡히 권했습니다. "할 수 있을 때 빠져나오십시오. 이 병들고 비뚤어진 세대에서 빠져나오십시오!"</w:t>
+              <w:t>베드로는 한참 동안 이렇게 계속 말하며 거듭 간곡히 권했습니다. "할 수 있을 때 빠져나오십시오. 이 병들고 비뚤어진 문화에서 빠져나오십시오!"</w:t>
             </w:r>
           </w:p>
         </w:tc>
@@ -31660,7 +31660,7 @@
               <w:rPr>
                 <w:sz w:val="18"/>
               </w:rPr>
-              <w:t>Back out at sea, we sailed north along the sheltered side of Cyprus, northeast of the island, because strong westerly winds were against us, then westward along the coast to the port of Myra. There the centurion found an Egyptian grain ship bound for Italy and transferred us aboard. We hit rough weather and couldn't hold our course. After a long, hard struggle, we finally reached the southern coast of Crete and docked at Fair Havens — fitting name!</w:t>
+              <w:t>Back out at sea, we sailed north along the sheltered side of Cyprus, northeast of the island, because strong westerly winds were against us, then westward along the coast to the port of Myra. There the centurion found an Egyptian ship bound for Italy and transferred us aboard. We hit rough weather and couldn't hold our course. After a long, hard struggle, we finally reached the southern coast of Crete and docked at Fair Havens — fitting name!</w:t>
             </w:r>
           </w:p>
         </w:tc>
@@ -33002,7 +33002,7 @@
               <w:rPr>
                 <w:sz w:val="18"/>
               </w:rPr>
-              <w:t>우리는 몰타에서 석 달 동안 정말 극진한 대접을 받았습니다. 필요한 것은 다 챙겨주고, 남은 여정에 쓸 물품까지 준비해줬습니다. 마침 항구에서 겨울을 난 이집트 배가 이탈리아로 간다기에 우리도 그 배에 탔습니다. 그 배의 뱃머리에는 쌍둥이자리, '하늘의 쌍둥이' 조각상이 새겨져 있었습니다.</w:t>
+              <w:t>우리는 몰타에서 석 달 동안 정말 극진한 대접을 받았습니다. 필요한 것은 다 챙겨주고, 남은 여정에 쓸 물품까지 준비해줬습니다. 마침 항구에서 겨울을 난 이집트 배가 이탈리아로 간다기에 우리도 그 배에 탔습니다. 그 배의 뱃머리에는 카스토르와 폴룩스, '하늘의 쌍둥이' 조각상이 새겨져 있었습니다.</w:t>
             </w:r>
           </w:p>
         </w:tc>

</xml_diff>